<commit_message>
Identidad FOLIO v2 «Gran Habilitación»: emblema, anillas por vitola, vista litográfica, caja y mockups
Inspirada en la gramática visual de las grandes marcas de Habanos con elementos
originales (sin escudos, medallas, fechas ni elementos de seguridad de terceros).
Actualiza manual de identidad, estrategia de marca, plan de empresa y memorándum.

Co-Authored-By: Claude Opus 5.5 <noreply@anthropic.com>
Claude-Session: https://claude.ai/code/session_01CvqttADUwhWNoyN5jfGGtF
</commit_message>
<xml_diff>
--- a/PROYECTO_CIGARS_CUBA_2027/02_BUSINESS_PLAN/Business Plan 2027–2031.docx
+++ b/PROYECTO_CIGARS_CUBA_2027/02_BUSINESS_PLAN/Business Plan 2027–2031.docx
@@ -706,7 +706,7 @@
         <w:pStyle w:val="FirstParagraph"/>
       </w:pPr>
       <w:r>
-        <w:t xml:space="preserve">Competidores directos de FOLIO OCTAVO: Habanos clásicos de formato robusto (≈21–22 €) y marcas no cubanas de prestigio (12–20 €). FOLIO se posiciona como</w:t>
+        <w:t xml:space="preserve">Competidores directos de FOLIO OCTAVO: Habanos clásicos de formato robusto (≈21–22 €) y marcas no cubanas de prestigio (12–20 €). FOLIO se posiciona en el lujo cubano clásico con una identidad de</w:t>
       </w:r>
       <w:r>
         <w:t xml:space="preserve"> </w:t>
@@ -716,10 +716,13 @@
           <w:bCs/>
           <w:b/>
         </w:rPr>
-        <w:t xml:space="preserve">Contemporary Cuban Luxury</w:t>
-      </w:r>
-      <w:r>
-        <w:t xml:space="preserve">: identidad de lujo silencioso, lotes numerados («pliegos»), colofón de trazabilidad; precio objetivo 24 € (Base) que exige superar en calidad percibida a referencias consolidadas. Matriz de posicionamiento: B 3,90 / C 3,35 / A 2,45 (</w:t>
+        <w:t xml:space="preserve">«Gran Habilitación»</w:t>
+      </w:r>
+      <w:r>
+        <w:t xml:space="preserve"> </w:t>
+      </w:r>
+      <w:r>
+        <w:t xml:space="preserve">—la gramática visual de las grandes marcas de Habanos (anilla con cartela, oro en relieve, guilloché, litografía de tapa) reinterpretada con elementos originales—, lotes numerados («pliegos») y colofón de trazabilidad; precio objetivo 24 € (Base) que exige superar en calidad percibida a referencias consolidadas. Matriz de posicionamiento: B 3,90 / C 3,35 / A 2,45 (</w:t>
       </w:r>
       <w:r>
         <w:rPr>
@@ -764,7 +767,7 @@
         <w:pStyle w:val="FirstParagraph"/>
       </w:pPr>
       <w:r>
-        <w:t xml:space="preserve">Para el estanquero especialista: una referencia diferenciada, consistente y documentada (ficha técnica, pliego, colofón), con rotación apoyada por catas técnicas profesionales. Para el consumidor adulto (sin comunicación directa): un objeto de lujo silencioso y numerado. Producto de lanzamiento:</w:t>
+        <w:t xml:space="preserve">Para el estanquero especialista: una referencia diferenciada, consistente y documentada (ficha técnica, pliego, colofón), con rotación apoyada por catas técnicas profesionales. Para el consumidor adulto (sin comunicación directa): un objeto de habilitación clásica, numerado y documentado. Producto de lanzamiento:</w:t>
       </w:r>
       <w:r>
         <w:t xml:space="preserve"> </w:t>

</xml_diff>

<commit_message>
Marca ARNALDO: nombre del torcedor, acuerdo de nombre/imagen y participación, brief creativo
- Sustituye FOLIO por ARNALDO en todo el dossier (FOLIO y LUMBRE quedan como reserva)
- Nuevo borrador de acuerdo con Arnaldo (licencia de nombre, firma e imagen; royalty/equity)
- Modelo financiero: parámetros de royalty y participación de Arnaldo
- Brief creativo para diseñador profesional e identidad provisional; v1/v2 archivadas
- Riesgos, decisiones, fuentes y plan de 180 días actualizados

Co-Authored-By: Claude Opus 5.5 <noreply@anthropic.com>
Claude-Session: https://claude.ai/code/session_01CvqttADUwhWNoyN5jfGGtF
</commit_message>
<xml_diff>
--- a/PROYECTO_CIGARS_CUBA_2027/02_BUSINESS_PLAN/Business Plan 2027–2031.docx
+++ b/PROYECTO_CIGARS_CUBA_2027/02_BUSINESS_PLAN/Business Plan 2027–2031.docx
@@ -33,7 +33,7 @@
         <w:pStyle w:val="Subtitle"/>
       </w:pPr>
       <w:r>
-        <w:t xml:space="preserve">FOLIO</w:t>
+        <w:t xml:space="preserve">ARNALDO</w:t>
       </w:r>
       <w:r>
         <w:t xml:space="preserve"> </w:t>
@@ -196,7 +196,20 @@
         <w:t xml:space="preserve"> </w:t>
       </w:r>
       <w:r>
-        <w:t xml:space="preserve">Crear FOLIO, una marca premium de cigarros hechos a mano, fabricada —si la Fase 0 lo confirma— en Cuba por una entidad autorizada con la colaboración técnica de un torcedor, e importada y distribuida en España por canales habilitados. En paralelo se evalúa la importación y distribución de cigarros premium de terceros.</w:t>
+        <w:t xml:space="preserve">Crear</w:t>
+      </w:r>
+      <w:r>
+        <w:t xml:space="preserve"> </w:t>
+      </w:r>
+      <w:r>
+        <w:rPr>
+          <w:bCs/>
+          <w:b/>
+        </w:rPr>
+        <w:t xml:space="preserve">ARNALDO</w:t>
+      </w:r>
+      <w:r>
+        <w:t xml:space="preserve">, una marca premium de cigarros hechos a mano que lleva el nombre —y, con su consentimiento, la firma— de Arnaldo, el torcedor cubano que participa en el proyecto; fabricada —si la Fase 0 lo confirma— en Cuba por una entidad autorizada con su colaboración técnica, e importada y distribuida en España por canales habilitados. En paralelo se evalúa la importación y distribución de cigarros premium de terceros.</w:t>
       </w:r>
     </w:p>
     <w:p>
@@ -453,7 +466,7 @@
               <w:jc w:val="left"/>
             </w:pPr>
             <w:r>
-              <w:t xml:space="preserve">Diseño, especificación, registro y comercialización B2B de FOLIO</w:t>
+              <w:t xml:space="preserve">Diseño, especificación, registro y comercialización B2B de ARNALDO</w:t>
             </w:r>
           </w:p>
         </w:tc>
@@ -706,7 +719,7 @@
         <w:pStyle w:val="FirstParagraph"/>
       </w:pPr>
       <w:r>
-        <w:t xml:space="preserve">Competidores directos de FOLIO OCTAVO: Habanos clásicos de formato robusto (≈21–22 €) y marcas no cubanas de prestigio (12–20 €). FOLIO se posiciona en el lujo cubano clásico con una identidad de</w:t>
+        <w:t xml:space="preserve">Competidores directos de ARNALDO Nº 1: Habanos clásicos de formato robusto (≈21–22 €) y marcas no cubanas de prestigio (12–20 €). ARNALDO se posiciona en el lujo cubano clásico con una identidad de</w:t>
       </w:r>
       <w:r>
         <w:t xml:space="preserve"> </w:t>
@@ -777,13 +790,13 @@
           <w:bCs/>
           <w:b/>
         </w:rPr>
-        <w:t xml:space="preserve">OCTAVO</w:t>
-      </w:r>
-      <w:r>
-        <w:t xml:space="preserve"> </w:t>
-      </w:r>
-      <w:r>
-        <w:t xml:space="preserve">(Robusto ≈124 × 50). Extensiones: CUARTO (2029), IMPERIAL (2030, limitada). Detalle:</w:t>
+        <w:t xml:space="preserve">Nº 1</w:t>
+      </w:r>
+      <w:r>
+        <w:t xml:space="preserve"> </w:t>
+      </w:r>
+      <w:r>
+        <w:t xml:space="preserve">(Robusto ≈124 × 50). Extensiones: Nº 2 (2029), Nº 3 (2030, limitada). Detalle:</w:t>
       </w:r>
       <w:r>
         <w:t xml:space="preserve"> </w:t>
@@ -883,19 +896,28 @@
               <w:jc w:val="left"/>
             </w:pPr>
             <w:r>
-              <w:t xml:space="preserve">Torcedor</w:t>
-            </w:r>
-          </w:p>
-        </w:tc>
-        <w:tc>
-          <w:tcPr/>
-          <w:p>
-            <w:pPr>
-              <w:pStyle w:val="Compact"/>
-              <w:jc w:val="left"/>
-            </w:pPr>
-            <w:r>
-              <w:t xml:space="preserve">Colaborador técnico a través de la entidad, con permiso del empleador</w:t>
+              <w:t xml:space="preserve">Torcedor (Arnaldo)</w:t>
+            </w:r>
+          </w:p>
+        </w:tc>
+        <w:tc>
+          <w:tcPr/>
+          <w:p>
+            <w:pPr>
+              <w:pStyle w:val="Compact"/>
+              <w:jc w:val="left"/>
+            </w:pPr>
+            <w:r>
+              <w:t xml:space="preserve">Da nombre a la marca y colabora técnicamente a través de la entidad, con permiso del empleador; participación económica según</w:t>
+            </w:r>
+            <w:r>
+              <w:t xml:space="preserve"> </w:t>
+            </w:r>
+            <w:r>
+              <w:rPr>
+                <w:rStyle w:val="VerbatimChar"/>
+              </w:rPr>
+              <w:t xml:space="preserve">Arnaldo Name &amp; Participation Agreement.docx</w:t>
             </w:r>
           </w:p>
         </w:tc>
@@ -1020,7 +1042,7 @@
           <w:bCs/>
           <w:b/>
         </w:rPr>
-        <w:t xml:space="preserve">FOLIO con origen República Dominicana o Nicaragua</w:t>
+        <w:t xml:space="preserve">ARNALDO con origen República Dominicana o Nicaragua</w:t>
       </w:r>
       <w:r>
         <w:t xml:space="preserve"> </w:t>
@@ -1651,13 +1673,13 @@
           <w:bCs/>
           <w:b/>
         </w:rPr>
-        <w:t xml:space="preserve">FOLIO</w:t>
-      </w:r>
-      <w:r>
-        <w:t xml:space="preserve"> </w:t>
-      </w:r>
-      <w:r>
-        <w:t xml:space="preserve">a nombre de la SL: EUIPO (clase 34) antes de compartir con terceros; Cuba (OCPI) vía agente oficial; reservas LUMBRE y VELADA.</w:t>
+        <w:t xml:space="preserve">ARNALDO</w:t>
+      </w:r>
+      <w:r>
+        <w:t xml:space="preserve"> </w:t>
+      </w:r>
+      <w:r>
+        <w:t xml:space="preserve">a nombre de la SL: EUIPO (clase 34) antes de compartir con terceros; Cuba (OCPI) vía agente oficial; reservas FOLIO y LUMBRE.</w:t>
       </w:r>
     </w:p>
     <w:p>
@@ -1669,7 +1691,14 @@
         <w:pStyle w:val="Compact"/>
       </w:pPr>
       <w:r>
-        <w:t xml:space="preserve">Diseños: cesión total del diseñador a la SL; registro de diseño UE de la anilla y caja si el coste lo justifica.</w:t>
+        <w:rPr>
+          <w:bCs/>
+          <w:b/>
+        </w:rPr>
+        <w:t xml:space="preserve">Nombre, firma e imagen de Arnaldo</w:t>
+      </w:r>
+      <w:r>
+        <w:t xml:space="preserve">: consentimiento escrito previo al registro (marca con nombre de persona) y licencia exclusiva, irrevocable, transferible y mundial a la SL; cláusulas de salida, conflicto y fallecimiento. Precedentes a evitar: Davidoff (disputa con Cubatabaco por la titularidad) y Vegas Robaina (marca con el nombre de un veguero, propiedad de Habanos S.A. desde 1997).</w:t>
       </w:r>
     </w:p>
     <w:p>
@@ -1681,7 +1710,66 @@
         <w:pStyle w:val="Compact"/>
       </w:pPr>
       <w:r>
-        <w:t xml:space="preserve">Contrato de fabricación: titularidad exclusiva de la marca, licencia de uso limitada a la producción contratada, confidencialidad de la ficha técnica, prohibición de producir FOLIO o imitaciones para terceros, devolución/destrucción de anillas y materiales sobrantes. Cláusulas en</w:t>
+        <w:rPr>
+          <w:bCs/>
+          <w:b/>
+        </w:rPr>
+        <w:t xml:space="preserve">Participación de Arnaldo</w:t>
+      </w:r>
+      <w:r>
+        <w:t xml:space="preserve">: recomendada en forma de participación en la SL (referencia: 10% con</w:t>
+      </w:r>
+      <w:r>
+        <w:t xml:space="preserve"> </w:t>
+      </w:r>
+      <w:r>
+        <w:rPr>
+          <w:iCs/>
+          <w:i/>
+        </w:rPr>
+        <w:t xml:space="preserve">vesting</w:t>
+      </w:r>
+      <w:r>
+        <w:t xml:space="preserve"> </w:t>
+      </w:r>
+      <w:r>
+        <w:t xml:space="preserve">a 4 años); un royalty del 2% sobre ingresos haría negativo el VAN incluso en el escenario Optimista (−4.561 €). Todo ello por vía legal y con autorización de su empleador. Detalle:</w:t>
+      </w:r>
+      <w:r>
+        <w:t xml:space="preserve"> </w:t>
+      </w:r>
+      <w:r>
+        <w:rPr>
+          <w:rStyle w:val="VerbatimChar"/>
+        </w:rPr>
+        <w:t xml:space="preserve">04_CUBA_LEGAL/Arnaldo Name &amp; Participation Agreement.docx</w:t>
+      </w:r>
+      <w:r>
+        <w:t xml:space="preserve">.</w:t>
+      </w:r>
+    </w:p>
+    <w:p>
+      <w:pPr>
+        <w:numPr>
+          <w:ilvl w:val="0"/>
+          <w:numId w:val="1004"/>
+        </w:numPr>
+        <w:pStyle w:val="Compact"/>
+      </w:pPr>
+      <w:r>
+        <w:t xml:space="preserve">Diseños: cesión total del diseñador a la SL; registro de diseño UE de la anilla y caja si el coste lo justifica.</w:t>
+      </w:r>
+    </w:p>
+    <w:p>
+      <w:pPr>
+        <w:numPr>
+          <w:ilvl w:val="0"/>
+          <w:numId w:val="1004"/>
+        </w:numPr>
+        <w:pStyle w:val="Compact"/>
+      </w:pPr>
+      <w:r>
+        <w:t xml:space="preserve">Contrato de fabricación: titularidad exclusiva de la marca, licencia de uso limitada a la producción contratada, confidencialidad de la ficha técnica, prohibición de producir ARNALDO o imitaciones para terceros, devolución/destrucción de anillas y materiales sobrantes. Cláusulas en</w:t>
       </w:r>
       <w:r>
         <w:t xml:space="preserve"> </w:t>
@@ -3521,7 +3609,7 @@
               <w:jc w:val="left"/>
             </w:pPr>
             <w:r>
-              <w:t xml:space="preserve">Extensiones CUARTO e IMPERIAL según KPIs</w:t>
+              <w:t xml:space="preserve">Extensiones Nº 2 e Nº 3 según KPIs</w:t>
             </w:r>
           </w:p>
         </w:tc>
@@ -3788,7 +3876,7 @@
         <w:pStyle w:val="BodyText"/>
       </w:pPr>
       <w:r>
-        <w:t xml:space="preserve">Ampliar a CUARTO sólo si se cumplen todos durante 12 meses.</w:t>
+        <w:t xml:space="preserve">Ampliar a Nº 2 sólo si se cumplen todos durante 12 meses.</w:t>
       </w:r>
     </w:p>
     <w:bookmarkEnd w:id="40"/>

</xml_diff>

<commit_message>
Revisió des del punt de vista d'un inversor: coherència i transparència
- Dossier: noves pàgines d'economia unitària (imports exactes del model),
  escenaris («què ha de ser veritat») i Fase 0 / ús del primer euro (24 pàg.).
- Escenaris, business case i memo: coherència entre volum i demanda
  accessible (punts de venda necessaris), efecte de la remuneració del
  promotor, mida del negoci en euros i palanca d'origen alternatiu.
- C4 inclou un dictamen de sancions UE/EUA (via V1 a través de Habanos S.A.).
- Pla de 180 dies: el disseny professional passa després del Go (la Fase 0
  queda en 12.100 € a 90 dies, dins del sostre de 15.000 €).
- Noves decisions D12 (proposta a inversors) i D13 (origen alternatiu).
- Business Plan i brief d'identitat actualitzats a la Ruta A v2; rang de
  fonts S01–S51.

Co-Authored-By: Claude Opus 5.5 <noreply@anthropic.com>
Claude-Session: https://claude.ai/code/session_017Cf1VjW9mqckGqcvuVgoNK
</commit_message>
<xml_diff>
--- a/PROYECTO_CIGARS_CUBA_2027/02_BUSINESS_PLAN/Business Plan 2027–2031.docx
+++ b/PROYECTO_CIGARS_CUBA_2027/02_BUSINESS_PLAN/Business Plan 2027–2031.docx
@@ -719,7 +719,7 @@
         <w:pStyle w:val="FirstParagraph"/>
       </w:pPr>
       <w:r>
-        <w:t xml:space="preserve">Competidores directos de ARNALDO Nº 1: Habanos clásicos de formato robusto (≈21–22 €) y marcas no cubanas de prestigio (12–20 €). ARNALDO se posiciona en el lujo cubano clásico con una identidad de</w:t>
+        <w:t xml:space="preserve">Competidores directos de ARNALDO Nº 1: Habanos clásicos de formato robusto (≈21–22 €) y marcas no cubanas de prestigio (12–20 €). ARNALDO se posiciona en el lujo cubano clásico con la</w:t>
       </w:r>
       <w:r>
         <w:t xml:space="preserve"> </w:t>
@@ -729,13 +729,25 @@
           <w:bCs/>
           <w:b/>
         </w:rPr>
-        <w:t xml:space="preserve">«Gran Habilitación»</w:t>
-      </w:r>
-      <w:r>
-        <w:t xml:space="preserve"> </w:t>
-      </w:r>
-      <w:r>
-        <w:t xml:space="preserve">—la gramática visual de las grandes marcas de Habanos (anilla con cartela, oro en relieve, guilloché, litografía de tapa) reinterpretada con elementos originales—, lotes numerados («pliegos») y colofón de trazabilidad; precio objetivo 24 € (Base) que exige superar en calidad percibida a referencias consolidadas. Matriz de posicionamiento: B 3,90 / C 3,35 / A 2,45 (</w:t>
+        <w:t xml:space="preserve">Ruta A v2</w:t>
+      </w:r>
+      <w:r>
+        <w:t xml:space="preserve"> </w:t>
+      </w:r>
+      <w:r>
+        <w:t xml:space="preserve">—la gramática visual de las grandes marcas de Habanos (anilla con cartela, oro en relieve, guilloché, litografía de tapa) traducida a elementos propios: medallón con las manos del torcedor, chavetas cruzadas y un patrón inspirado en la yagua; ver</w:t>
+      </w:r>
+      <w:r>
+        <w:t xml:space="preserve"> </w:t>
+      </w:r>
+      <w:r>
+        <w:rPr>
+          <w:rStyle w:val="VerbatimChar"/>
+        </w:rPr>
+        <w:t xml:space="preserve">01_BRAND/ARNALDO Brand Dossier.pdf</w:t>
+      </w:r>
+      <w:r>
+        <w:t xml:space="preserve">—, lotes numerados («pliegos») y colofón de trazabilidad; precio objetivo 24 € (Base) que exige superar en calidad percibida a referencias consolidadas. Matriz de posicionamiento: B 3,90 / C 3,35 / A 2,45 (</w:t>
       </w:r>
       <w:r>
         <w:rPr>
@@ -3376,7 +3388,7 @@
               <w:jc w:val="left"/>
             </w:pPr>
             <w:r>
-              <w:t xml:space="preserve">Screening UE/ONU/OFAC; nada en USD</w:t>
+              <w:t xml:space="preserve">Dictamen de sanciones UE/EE. UU. antes del primer pago (C4); screening UE/ONU/OFAC; nada en USD</w:t>
             </w:r>
           </w:p>
         </w:tc>
@@ -3635,7 +3647,7 @@
         <w:t xml:space="preserve"> </w:t>
       </w:r>
       <w:r>
-        <w:t xml:space="preserve">(coste estimado 24.100 €).</w:t>
+        <w:t xml:space="preserve">(coste estimado 25.100 €).</w:t>
       </w:r>
     </w:p>
     <w:bookmarkEnd w:id="39"/>
@@ -3902,7 +3914,7 @@
         <w:pStyle w:val="BodyText"/>
       </w:pPr>
       <w:r>
-        <w:t xml:space="preserve">Fuentes: Source Register (S01–S48, N01–N07), consulta 10/10/2026.</w:t>
+        <w:t xml:space="preserve">Fuentes: Source Register (S01–S51, N01–N07), consulta 10/10/2026.</w:t>
       </w:r>
     </w:p>
     <w:bookmarkEnd w:id="41"/>

</xml_diff>

<commit_message>
Ruta A v3 «Casa cubana clàssica»: fora fulla i chaveta, gramàtica de les cases de Habanos
- Dossier: nova pàgina de direcció creativa amb els codis comuns de les
  cases (signatura, lacre i or amb perlat, cartel·la, retrat, segona
  anella, habilitació de la caixa, cedre amb la marca a foc).
- Fora del dossier les imatges de la fulla i la chaveta; pàgines noves de
  doble anella i caixa quan hi hagi els renders v3.
- Brief d'identitat, pla de negoci i Prompt Pack actualitzats; fonts
  S55–S58 (Bock, glossari Habanos, habilitació de la caixa, Bolívar).
- Cua de renders v3 per a la propera quota.

Co-Authored-By: Claude Opus 5.5 <noreply@anthropic.com>
Claude-Session: https://claude.ai/code/session_017Cf1VjW9mqckGqcvuVgoNK
</commit_message>
<xml_diff>
--- a/PROYECTO_CIGARS_CUBA_2027/02_BUSINESS_PLAN/Business Plan 2027–2031.docx
+++ b/PROYECTO_CIGARS_CUBA_2027/02_BUSINESS_PLAN/Business Plan 2027–2031.docx
@@ -729,13 +729,13 @@
           <w:bCs/>
           <w:b/>
         </w:rPr>
-        <w:t xml:space="preserve">Ruta A v2</w:t>
-      </w:r>
-      <w:r>
-        <w:t xml:space="preserve"> </w:t>
-      </w:r>
-      <w:r>
-        <w:t xml:space="preserve">—la gramática visual de las grandes marcas de Habanos (anilla con cartela, oro en relieve, guilloché, litografía de tapa) traducida a elementos propios: medallón con las manos del torcedor, la chaveta bajo una hoja de tabaco y un patrón inspirado en la yagua; ver</w:t>
+        <w:t xml:space="preserve">Ruta A v3 «Casa cubana clásica»</w:t>
+      </w:r>
+      <w:r>
+        <w:t xml:space="preserve"> </w:t>
+      </w:r>
+      <w:r>
+        <w:t xml:space="preserve">—la gramática común de las casas de Habanos (anilla lacre y oro con cartela troquelada, perlado y guilloché, segunda anilla de serie, vista, larguero y costero, caja de cedro) llenada con contenido propio: el nombre y la firma real de Arnaldo; ver</w:t>
       </w:r>
       <w:r>
         <w:t xml:space="preserve"> </w:t>

</xml_diff>

<commit_message>
Ruta A v4 «Montecristo × Hoyo de Monterrey»: art vectorial sense errors de text
Anelles Nº 1–3, segona anella «Pliego de autor», emblema, vista i marca a foc
en vectorial (_build/brand_v4.py, text en traçats). Maqueta de la caixa amb la
marca gravada per homografia. Dossier, brief d'identitat, pla de negoci, Prompt
Pack i README actualitzats; fonts S59–S61. Cua de fotos sense text per al 14/10.

Co-Authored-By: Claude Opus 5.5 <noreply@anthropic.com>
Claude-Session: https://claude.ai/code/session_017Cf1VjW9mqckGqcvuVgoNK
</commit_message>
<xml_diff>
--- a/PROYECTO_CIGARS_CUBA_2027/02_BUSINESS_PLAN/Business Plan 2027–2031.docx
+++ b/PROYECTO_CIGARS_CUBA_2027/02_BUSINESS_PLAN/Business Plan 2027–2031.docx
@@ -729,13 +729,13 @@
           <w:bCs/>
           <w:b/>
         </w:rPr>
-        <w:t xml:space="preserve">Ruta A v3 «Casa cubana clásica»</w:t>
-      </w:r>
-      <w:r>
-        <w:t xml:space="preserve"> </w:t>
-      </w:r>
-      <w:r>
-        <w:t xml:space="preserve">—la gramática común de las casas de Habanos (anilla lacre y oro con cartela troquelada, perlado y guilloché, segunda anilla de serie, vista, larguero y costero, caja de cedro) llenada con contenido propio: el nombre y la firma real de Arnaldo; ver</w:t>
+        <w:t xml:space="preserve">Ruta A v4 «Montecristo × Hoyo de Monterrey»</w:t>
+      </w:r>
+      <w:r>
+        <w:t xml:space="preserve"> </w:t>
+      </w:r>
+      <w:r>
+        <w:t xml:space="preserve">—anilla marfil con medallón lacre troquelado y el nombre en romanas gruesas, un solo emblema, segunda anilla «Pliego de autor», vista y caja de cedro con la marca a fuego, con contenido propio: el nombre y la firma real de Arnaldo; ver</w:t>
       </w:r>
       <w:r>
         <w:t xml:space="preserve"> </w:t>

</xml_diff>

<commit_message>
Disseny de la casa: l'anella clàssica (triada pel promotor); fora la v4 i la «A»
La foto de l'anella clàssica passa a portada i a la pàgina de la Nº 1, amb la
signatura inventada per la IA substituïda per «Arnaldo» (fix_clasica_firma.py).
Anella redibuixada en vectorial (brand_clasica.py): Nº 1 lacre, Nº 2 marfil,
Nº 3 negra, segona anella, oval, vista i marca a foc sense monograma. Ruta A v4
arxivada a assets/_v4_descartada. Dossier, brief, pla de negoci, Prompt Pack i
README actualitzats.

Co-Authored-By: Claude Opus 5.5 <noreply@anthropic.com>
Claude-Session: https://claude.ai/code/session_017Cf1VjW9mqckGqcvuVgoNK
</commit_message>
<xml_diff>
--- a/PROYECTO_CIGARS_CUBA_2027/02_BUSINESS_PLAN/Business Plan 2027–2031.docx
+++ b/PROYECTO_CIGARS_CUBA_2027/02_BUSINESS_PLAN/Business Plan 2027–2031.docx
@@ -729,13 +729,13 @@
           <w:bCs/>
           <w:b/>
         </w:rPr>
-        <w:t xml:space="preserve">Ruta A v4 «Montecristo × Hoyo de Monterrey»</w:t>
-      </w:r>
-      <w:r>
-        <w:t xml:space="preserve"> </w:t>
-      </w:r>
-      <w:r>
-        <w:t xml:space="preserve">—anilla marfil con medallón lacre troquelado y el nombre en romanas gruesas, un solo emblema, segunda anilla «Pliego de autor», vista y caja de cedro con la marca a fuego, con contenido propio: el nombre y la firma real de Arnaldo; ver</w:t>
+        <w:t xml:space="preserve">anilla clásica</w:t>
+      </w:r>
+      <w:r>
+        <w:t xml:space="preserve"> </w:t>
+      </w:r>
+      <w:r>
+        <w:t xml:space="preserve">como diseño de la casa —banda lacre con cantos de oro perlados, óvalo central de laca negra enmarcado en oro con ARNALDO en capitales romanas y la firma de Arnaldo debajo, segunda anilla «Pliego de autor», vista y caja de cedro con la marca a fuego; referencias: Hoyo de Monterrey y Montecristo; ver</w:t>
       </w:r>
       <w:r>
         <w:t xml:space="preserve"> </w:t>

</xml_diff>

<commit_message>
Rebranding: la marca passa a ARNALDO VALLÉS (nom i cognom del torcedor)
Oval de l'anella: ARNALDO VALLÉS en capitals en arc + signatura «Arnaldo
Vallés». Foto de referència retocada (original conservat), art vectorial,
maquetes, logotip, wordmark provisional i marca a foc regenerats. Tots els
documents, models i XLSX actualitzats; dossier reanomenat. Naming: DON VALLES
(EUA, puros, 2016) afegit com a anterioritat a analitzar (S62).

Co-Authored-By: Claude Opus 5.5 <noreply@anthropic.com>
Claude-Session: https://claude.ai/code/session_017Cf1VjW9mqckGqcvuVgoNK
</commit_message>
<xml_diff>
--- a/PROYECTO_CIGARS_CUBA_2027/02_BUSINESS_PLAN/Business Plan 2027–2031.docx
+++ b/PROYECTO_CIGARS_CUBA_2027/02_BUSINESS_PLAN/Business Plan 2027–2031.docx
@@ -34,6 +34,12 @@
       </w:pPr>
       <w:r>
         <w:t xml:space="preserve">ARNALDO</w:t>
+      </w:r>
+      <w:r>
+        <w:t xml:space="preserve"> </w:t>
+      </w:r>
+      <w:r>
+        <w:t xml:space="preserve">VALLÉS</w:t>
       </w:r>
       <w:r>
         <w:t xml:space="preserve"> </w:t>
@@ -206,10 +212,10 @@
           <w:bCs/>
           <w:b/>
         </w:rPr>
-        <w:t xml:space="preserve">ARNALDO</w:t>
-      </w:r>
-      <w:r>
-        <w:t xml:space="preserve">, una marca premium de cigarros hechos a mano que lleva el nombre —y, con su consentimiento, la firma— de Arnaldo, el torcedor cubano que participa en el proyecto; fabricada —si la Fase 0 lo confirma— en Cuba por una entidad autorizada con su colaboración técnica, e importada y distribuida en España por canales habilitados. En paralelo se evalúa la importación y distribución de cigarros premium de terceros.</w:t>
+        <w:t xml:space="preserve">ARNALDO VALLÉS</w:t>
+      </w:r>
+      <w:r>
+        <w:t xml:space="preserve">, una marca premium de cigarros hechos a mano que lleva el nombre —y, con su consentimiento, la firma— de Arnaldo Vallés, el torcedor cubano que participa en el proyecto; fabricada —si la Fase 0 lo confirma— en Cuba por una entidad autorizada con su colaboración técnica, e importada y distribuida en España por canales habilitados. En paralelo se evalúa la importación y distribución de cigarros premium de terceros.</w:t>
       </w:r>
     </w:p>
     <w:p>
@@ -466,7 +472,7 @@
               <w:jc w:val="left"/>
             </w:pPr>
             <w:r>
-              <w:t xml:space="preserve">Diseño, especificación, registro y comercialización B2B de ARNALDO</w:t>
+              <w:t xml:space="preserve">Diseño, especificación, registro y comercialización B2B de ARNALDO VALLÉS</w:t>
             </w:r>
           </w:p>
         </w:tc>
@@ -719,7 +725,7 @@
         <w:pStyle w:val="FirstParagraph"/>
       </w:pPr>
       <w:r>
-        <w:t xml:space="preserve">Competidores directos de ARNALDO Nº 1: Habanos clásicos de formato robusto (≈21–22 €) y marcas no cubanas de prestigio (12–20 €). ARNALDO se posiciona en el lujo cubano clásico con la</w:t>
+        <w:t xml:space="preserve">Competidores directos de ARNALDO VALLÉS Nº 1: Habanos clásicos de formato robusto (≈21–22 €) y marcas no cubanas de prestigio (12–20 €). ARNALDO VALLÉS se posiciona en el lujo cubano clásico con la</w:t>
       </w:r>
       <w:r>
         <w:t xml:space="preserve"> </w:t>
@@ -735,7 +741,7 @@
         <w:t xml:space="preserve"> </w:t>
       </w:r>
       <w:r>
-        <w:t xml:space="preserve">como diseño de la casa —banda lacre con cantos de oro perlados, óvalo central de laca negra enmarcado en oro con ARNALDO en capitales romanas y la firma de Arnaldo debajo, segunda anilla «Pliego de autor», vista y caja de cedro con la marca a fuego; referencias: Hoyo de Monterrey y Montecristo; ver</w:t>
+        <w:t xml:space="preserve">como diseño de la casa —banda lacre con cantos de oro perlados, óvalo central de laca negra enmarcado en oro con ARNALDO VALLÉS en capitales romanas y la firma de Arnaldo debajo, segunda anilla «Pliego de autor», vista y caja de cedro con la marca a fuego; referencias: Hoyo de Monterrey y Montecristo; ver</w:t>
       </w:r>
       <w:r>
         <w:t xml:space="preserve"> </w:t>
@@ -744,7 +750,7 @@
         <w:rPr>
           <w:rStyle w:val="VerbatimChar"/>
         </w:rPr>
-        <w:t xml:space="preserve">01_BRAND/ARNALDO Brand Dossier.pdf</w:t>
+        <w:t xml:space="preserve">01_BRAND/ARNALDO VALLÉS Brand Dossier.pdf</w:t>
       </w:r>
       <w:r>
         <w:t xml:space="preserve">—, lotes numerados («pliegos») y colofón de trazabilidad; precio objetivo 24 € (Base) que exige superar en calidad percibida a referencias consolidadas. Matriz de posicionamiento: B 3,90 / C 3,35 / A 2,45 (</w:t>
@@ -1054,7 +1060,7 @@
           <w:bCs/>
           <w:b/>
         </w:rPr>
-        <w:t xml:space="preserve">ARNALDO con origen República Dominicana o Nicaragua</w:t>
+        <w:t xml:space="preserve">ARNALDO VALLÉS con origen República Dominicana o Nicaragua</w:t>
       </w:r>
       <w:r>
         <w:t xml:space="preserve"> </w:t>
@@ -1685,7 +1691,7 @@
           <w:bCs/>
           <w:b/>
         </w:rPr>
-        <w:t xml:space="preserve">ARNALDO</w:t>
+        <w:t xml:space="preserve">ARNALDO VALLÉS</w:t>
       </w:r>
       <w:r>
         <w:t xml:space="preserve"> </w:t>
@@ -1781,7 +1787,7 @@
         <w:pStyle w:val="Compact"/>
       </w:pPr>
       <w:r>
-        <w:t xml:space="preserve">Contrato de fabricación: titularidad exclusiva de la marca, licencia de uso limitada a la producción contratada, confidencialidad de la ficha técnica, prohibición de producir ARNALDO o imitaciones para terceros, devolución/destrucción de anillas y materiales sobrantes. Cláusulas en</w:t>
+        <w:t xml:space="preserve">Contrato de fabricación: titularidad exclusiva de la marca, licencia de uso limitada a la producción contratada, confidencialidad de la ficha técnica, prohibición de producir ARNALDO VALLÉS o imitaciones para terceros, devolución/destrucción de anillas y materiales sobrantes. Cláusulas en</w:t>
       </w:r>
       <w:r>
         <w:t xml:space="preserve"> </w:t>

</xml_diff>